<commit_message>
Segunda função de análise: Trás os top 10 fundos com maior captação mensal no mês desejado, convertendo a coluna captacao_liquida_mensal para valor decimal e no formato de moeda brasileira (BRL)
</commit_message>
<xml_diff>
--- a/Documentação inicial do projeto de dados diários de fundos de investimentos.docx
+++ b/Documentação inicial do projeto de dados diários de fundos de investimentos.docx
@@ -26,7 +26,10 @@
         </w:numPr>
       </w:pPr>
       <w:r>
-        <w:t>Evolução do patrimônio líquido de um fundo específico</w:t>
+        <w:t>T</w:t>
+      </w:r>
+      <w:r>
+        <w:t>op 10 fundos por patrimônio em uma data específica</w:t>
       </w:r>
     </w:p>
     <w:p>
@@ -38,10 +41,19 @@
         </w:numPr>
       </w:pPr>
       <w:r>
-        <w:t>Retorno diário d</w:t>
-      </w:r>
-      <w:r>
-        <w:t>e um fundo</w:t>
+        <w:t>T</w:t>
+      </w:r>
+      <w:r>
+        <w:t xml:space="preserve">op 10 fundos </w:t>
+      </w:r>
+      <w:r>
+        <w:t>com maior número de cotistas</w:t>
+      </w:r>
+      <w:r>
+        <w:t xml:space="preserve"> </w:t>
+      </w:r>
+      <w:r>
+        <w:t>em uma data específica</w:t>
       </w:r>
     </w:p>
     <w:p>
@@ -53,10 +65,10 @@
         </w:numPr>
       </w:pPr>
       <w:r>
-        <w:t>T</w:t>
-      </w:r>
-      <w:r>
-        <w:t>op 10 fundos por patrimônio em uma data específica</w:t>
+        <w:t xml:space="preserve">Top 10 fundos com maior captação </w:t>
+      </w:r>
+      <w:r>
+        <w:t>em uma data específica</w:t>
       </w:r>
     </w:p>
     <w:p>
@@ -73,6 +85,33 @@
     </w:p>
     <w:p>
       <w:pPr>
+        <w:pStyle w:val="PargrafodaLista"/>
+        <w:numPr>
+          <w:ilvl w:val="0"/>
+          <w:numId w:val="1"/>
+        </w:numPr>
+      </w:pPr>
+      <w:r>
+        <w:t>Evolução do patrimônio líquido de um fundo específico</w:t>
+      </w:r>
+    </w:p>
+    <w:p>
+      <w:pPr>
+        <w:pStyle w:val="PargrafodaLista"/>
+        <w:numPr>
+          <w:ilvl w:val="0"/>
+          <w:numId w:val="1"/>
+        </w:numPr>
+      </w:pPr>
+      <w:r>
+        <w:t>Retorno diário d</w:t>
+      </w:r>
+      <w:r>
+        <w:t>e um fundo</w:t>
+      </w:r>
+    </w:p>
+    <w:p>
+      <w:pPr>
         <w:numPr>
           <w:ilvl w:val="0"/>
           <w:numId w:val="2"/>
@@ -96,23 +135,6 @@
         </w:tabs>
       </w:pPr>
       <w:r>
-        <w:t>Ranking de fundos com maior número de cotistas</w:t>
-      </w:r>
-      <w:r>
-        <w:t xml:space="preserve"> em certo período</w:t>
-      </w:r>
-    </w:p>
-    <w:p>
-      <w:pPr>
-        <w:numPr>
-          <w:ilvl w:val="0"/>
-          <w:numId w:val="2"/>
-        </w:numPr>
-        <w:tabs>
-          <w:tab w:val="num" w:pos="720"/>
-        </w:tabs>
-      </w:pPr>
-      <w:r>
         <w:t>Percentual de variação do patrimônio líquido mês a mês</w:t>
       </w:r>
     </w:p>
@@ -147,58 +169,42 @@
       </w:r>
     </w:p>
     <w:p>
-      <w:r>
-        <w:t>Posteriormente</w:t>
-      </w:r>
-      <w:r>
-        <w:t xml:space="preserve">, essas análises podem </w:t>
-      </w:r>
-      <w:r>
-        <w:t>utilizadas para criar dashboards no Power BI, além da criação de alertas por e-mail para determinados indicadores diários ou semanais que forem identificados como relevantes</w:t>
+      <w:pPr>
+        <w:ind w:left="360"/>
+      </w:pPr>
+      <w:r>
+        <w:t xml:space="preserve">*Para os indicadores de um fundo específico, usar os fundos que aparecerem no top 1 dos rankings de número de cotistas, patrimônio líquido e </w:t>
       </w:r>
     </w:p>
     <w:p>
       <w:r>
-        <w:br w:type="page"/>
+        <w:t>Posteriormente</w:t>
+      </w:r>
+      <w:r>
+        <w:t xml:space="preserve">, essas análises podem </w:t>
+      </w:r>
+      <w:r>
+        <w:t>utilizadas para criar dashboards no Power BI, além da criação de alertas por e-mail para determinados indicadores diários ou semanais que forem identificados como relevantes</w:t>
       </w:r>
     </w:p>
     <w:p>
       <w:r>
+        <w:br w:type="page"/>
+      </w:r>
+    </w:p>
+    <w:p>
+      <w:r>
         <w:lastRenderedPageBreak/>
         <w:t>Algumas decisões tomadas:</w:t>
       </w:r>
       <w:r>
         <w:br/>
-        <w:t>Inseri uma coluna na tabela do SQL chamada “</w:t>
-      </w:r>
-      <w:proofErr w:type="spellStart"/>
-      <w:r>
-        <w:t>flag_subclasse</w:t>
-      </w:r>
-      <w:proofErr w:type="spellEnd"/>
-      <w:r>
-        <w:t>”, a qual é preenchida com 1 quando a coluna “</w:t>
-      </w:r>
-      <w:proofErr w:type="spellStart"/>
-      <w:r>
-        <w:t>id_subclasse</w:t>
-      </w:r>
-      <w:proofErr w:type="spellEnd"/>
-      <w:r>
-        <w:t xml:space="preserve">” possui um valor e com 0 quando essa coluna é “não se aplica”, a fim de facilitar análises que precisem dessa diferenciação. </w:t>
+        <w:t xml:space="preserve">Inseri uma coluna na tabela do SQL chamada “flag_subclasse”, a qual é preenchida com 1 quando a coluna “id_subclasse” possui um valor e com 0 quando essa coluna é “não se aplica”, a fim de facilitar análises que precisem dessa diferenciação. </w:t>
       </w:r>
     </w:p>
     <w:p>
       <w:r>
-        <w:t xml:space="preserve">Quando um fundo que possuía a </w:t>
-      </w:r>
-      <w:proofErr w:type="spellStart"/>
-      <w:r>
-        <w:t>flag_subclasse</w:t>
-      </w:r>
-      <w:proofErr w:type="spellEnd"/>
-      <w:r>
-        <w:t xml:space="preserve"> igual a 0 passar a ter a flag igual a 1</w:t>
+        <w:t>Quando um fundo que possuía a flag_subclasse igual a 0 passar a ter a flag igual a 1</w:t>
       </w:r>
       <w:r>
         <w:t xml:space="preserve"> em um determinado momento da série histórica</w:t>
@@ -229,6 +235,11 @@
       </w:r>
       <w:r>
         <w:t>.</w:t>
+      </w:r>
+    </w:p>
+    <w:p>
+      <w:r>
+        <w:t>Ajustei o código que insere os dados na tabela do SQL para não ignorar linhas que já foram inseridas, mas sim verificar se há alguma coluna com dados diferentes nessas linhas que já foram inseridas na base e, se sim, atualizar, se não, ignorar.</w:t>
       </w:r>
     </w:p>
     <w:sectPr>

</xml_diff>

<commit_message>
Pequenos ajustes na query de análises e o word de documentação
</commit_message>
<xml_diff>
--- a/Documentação inicial do projeto de dados diários de fundos de investimentos.docx
+++ b/Documentação inicial do projeto de dados diários de fundos de investimentos.docx
@@ -29,7 +29,13 @@
         <w:t>T</w:t>
       </w:r>
       <w:r>
-        <w:t>op 10 fundos por patrimônio em uma data específica</w:t>
+        <w:t xml:space="preserve">op 10 fundos por patrimônio </w:t>
+      </w:r>
+      <w:r>
+        <w:t xml:space="preserve">líquido </w:t>
+      </w:r>
+      <w:r>
+        <w:t>em uma data específica</w:t>
       </w:r>
     </w:p>
     <w:p>
@@ -173,7 +179,16 @@
         <w:ind w:left="360"/>
       </w:pPr>
       <w:r>
-        <w:t xml:space="preserve">*Para os indicadores de um fundo específico, usar os fundos que aparecerem no top 1 dos rankings de número de cotistas, patrimônio líquido e </w:t>
+        <w:t xml:space="preserve">*Para os indicadores de um fundo específico, usar </w:t>
+      </w:r>
+      <w:r>
+        <w:t xml:space="preserve">como exemplo </w:t>
+      </w:r>
+      <w:r>
+        <w:t xml:space="preserve">os fundos que aparecerem no top 1 dos rankings de número de cotistas, patrimônio líquido e </w:t>
+      </w:r>
+      <w:r>
+        <w:t>captação</w:t>
       </w:r>
     </w:p>
     <w:p>

</xml_diff>